<commit_message>
docs: team leader and deployment link in team sheet, shared presenter plan, full team info on title slide, README screenshots
</commit_message>
<xml_diff>
--- a/documentation/Week 11 Assignment — Deployment/CSE4204-8A-T05 Deployment.docx
+++ b/documentation/Week 11 Assignment — Deployment/CSE4204-8A-T05 Deployment.docx
@@ -517,7 +517,7 @@
                 <w:sz w:val="22"/>
                 <w:szCs w:val="22"/>
               </w:rPr>
-              <w:t>Team Member List with IDs</w:t>
+              <w:t>Team Leader</w:t>
             </w:r>
           </w:p>
         </w:tc>
@@ -545,55 +545,7 @@
                 <w:sz w:val="22"/>
                 <w:szCs w:val="22"/>
               </w:rPr>
-              <w:t>1. Mahammad Hasan (ID: 11220320828) - Team Leader / Frontend Developer + UI/UX Designer</w:t>
-            </w:r>
-          </w:p>
-          <w:p>
-            <w:pPr>
-              <w:pStyle w:val="Normal"/>
-              <w:spacing w:lineRule="exact" w:line="264" w:before="0" w:after="20"/>
-              <w:rPr/>
-            </w:pPr>
-            <w:r>
-              <w:rPr>
-                <w:b w:val="false"/>
-                <w:bCs w:val="false"/>
-                <w:sz w:val="22"/>
-                <w:szCs w:val="22"/>
-              </w:rPr>
-              <w:t>2. Shanawaz Sakib (ID: 11220320916) - Core System Integration Engineer</w:t>
-            </w:r>
-          </w:p>
-          <w:p>
-            <w:pPr>
-              <w:pStyle w:val="Normal"/>
-              <w:spacing w:lineRule="exact" w:line="264" w:before="0" w:after="20"/>
-              <w:rPr/>
-            </w:pPr>
-            <w:r>
-              <w:rPr>
-                <w:b w:val="false"/>
-                <w:bCs w:val="false"/>
-                <w:sz w:val="22"/>
-                <w:szCs w:val="22"/>
-              </w:rPr>
-              <w:t>3. Ashikur Rahman Himel (ID: 11220320833) - Database Storage &amp; Quality Controller</w:t>
-            </w:r>
-          </w:p>
-          <w:p>
-            <w:pPr>
-              <w:pStyle w:val="Normal"/>
-              <w:spacing w:lineRule="exact" w:line="264" w:before="0" w:after="20"/>
-              <w:rPr/>
-            </w:pPr>
-            <w:r>
-              <w:rPr>
-                <w:b w:val="false"/>
-                <w:bCs w:val="false"/>
-                <w:sz w:val="22"/>
-                <w:szCs w:val="22"/>
-              </w:rPr>
-              <w:t>4. Rasel Ratul (ID: 11220320827) - Backend Developer</w:t>
+              <w:t>Mahammad Hasan (ID: 11220320828)</w:t>
             </w:r>
           </w:p>
         </w:tc>
@@ -626,7 +578,116 @@
                 <w:sz w:val="22"/>
                 <w:szCs w:val="22"/>
               </w:rPr>
-              <w:t>Live Application Link</w:t>
+              <w:t>Team Member List with IDs</w:t>
+            </w:r>
+          </w:p>
+        </w:tc>
+        <w:tc>
+          <w:tcPr>
+            <w:tcW w:w="6425" w:type="dxa"/>
+            <w:tcBorders>
+              <w:top w:val="single" w:sz="4" w:space="0" w:color="000000"/>
+              <w:left w:val="single" w:sz="4" w:space="0" w:color="000000"/>
+              <w:bottom w:val="single" w:sz="4" w:space="0" w:color="000000"/>
+              <w:right w:val="single" w:sz="4" w:space="0" w:color="000000"/>
+            </w:tcBorders>
+            <w:vAlign w:val="center"/>
+          </w:tcPr>
+          <w:p>
+            <w:pPr>
+              <w:pStyle w:val="Normal"/>
+              <w:spacing w:lineRule="exact" w:line="264" w:before="0" w:after="20"/>
+              <w:rPr/>
+            </w:pPr>
+            <w:r>
+              <w:rPr>
+                <w:b w:val="false"/>
+                <w:bCs w:val="false"/>
+                <w:sz w:val="22"/>
+                <w:szCs w:val="22"/>
+              </w:rPr>
+              <w:t>1. Mahammad Hasan (ID: 11220320828) - Team Leader / Frontend Developer + UI/UX Designer</w:t>
+            </w:r>
+          </w:p>
+          <w:p>
+            <w:pPr>
+              <w:pStyle w:val="Normal"/>
+              <w:spacing w:lineRule="exact" w:line="264" w:before="0" w:after="20"/>
+              <w:rPr/>
+            </w:pPr>
+            <w:r>
+              <w:rPr>
+                <w:b w:val="false"/>
+                <w:bCs w:val="false"/>
+                <w:sz w:val="22"/>
+                <w:szCs w:val="22"/>
+              </w:rPr>
+              <w:t>2. Shanawaz Sakib (ID: 11220320916) - Core System Integration Engineer</w:t>
+            </w:r>
+          </w:p>
+          <w:p>
+            <w:pPr>
+              <w:pStyle w:val="Normal"/>
+              <w:spacing w:lineRule="exact" w:line="264" w:before="0" w:after="20"/>
+              <w:rPr/>
+            </w:pPr>
+            <w:r>
+              <w:rPr>
+                <w:b w:val="false"/>
+                <w:bCs w:val="false"/>
+                <w:sz w:val="22"/>
+                <w:szCs w:val="22"/>
+              </w:rPr>
+              <w:t>3. Ashikur Rahman Himel (ID: 11220320833) - Database Storage &amp; Quality Controller</w:t>
+            </w:r>
+          </w:p>
+          <w:p>
+            <w:pPr>
+              <w:pStyle w:val="Normal"/>
+              <w:spacing w:lineRule="exact" w:line="264" w:before="0" w:after="20"/>
+              <w:rPr/>
+            </w:pPr>
+            <w:r>
+              <w:rPr>
+                <w:b w:val="false"/>
+                <w:bCs w:val="false"/>
+                <w:sz w:val="22"/>
+                <w:szCs w:val="22"/>
+              </w:rPr>
+              <w:t>4. Rasel Ratul (ID: 11220320827) - Backend Developer</w:t>
+            </w:r>
+          </w:p>
+        </w:tc>
+      </w:tr>
+      <w:tr>
+        <w:trPr>
+          <w:cantSplit w:val="true"/>
+        </w:trPr>
+        <w:tc>
+          <w:tcPr>
+            <w:tcW w:w="2600" w:type="dxa"/>
+            <w:tcBorders>
+              <w:top w:val="single" w:sz="4" w:space="0" w:color="000000"/>
+              <w:left w:val="single" w:sz="4" w:space="0" w:color="000000"/>
+              <w:bottom w:val="single" w:sz="4" w:space="0" w:color="000000"/>
+              <w:right w:val="single" w:sz="4" w:space="0" w:color="000000"/>
+            </w:tcBorders>
+            <w:vAlign w:val="center"/>
+          </w:tcPr>
+          <w:p>
+            <w:pPr>
+              <w:pStyle w:val="Normal"/>
+              <w:spacing w:lineRule="exact" w:line="264" w:before="0" w:after="20"/>
+              <w:rPr/>
+            </w:pPr>
+            <w:r>
+              <w:rPr>
+                <w:b/>
+                <w:bCs/>
+                <w:sz w:val="22"/>
+                <w:szCs w:val="22"/>
+              </w:rPr>
+              <w:t>Deployment Link (Live URL)</w:t>
             </w:r>
           </w:p>
         </w:tc>

</xml_diff>

<commit_message>
docs: redesigned architecture, ERD, AI workflow and auth diagrams
</commit_message>
<xml_diff>
--- a/documentation/Week 11 Assignment — Deployment/CSE4204-8A-T05 Deployment.docx
+++ b/documentation/Week 11 Assignment — Deployment/CSE4204-8A-T05 Deployment.docx
@@ -1597,7 +1597,7 @@
         <w:rPr/>
         <w:drawing>
           <wp:inline distT="0" distB="0" distL="0" distR="0">
-            <wp:extent cx="5667375" cy="2124075"/>
+            <wp:extent cx="5667375" cy="3133725"/>
             <wp:effectExtent l="0" t="0" r="0" b="0"/>
             <wp:docPr id="3" name="architecture.png" descr="Deployment architecture&#10;Deployment architecture"/>
             <wp:cNvGraphicFramePr>
@@ -1621,7 +1621,7 @@
                   <pic:spPr bwMode="auto">
                     <a:xfrm>
                       <a:off x="0" y="0"/>
-                      <a:ext cx="5667375" cy="2124075"/>
+                      <a:ext cx="5667375" cy="3133725"/>
                     </a:xfrm>
                     <a:prstGeom prst="rect">
                       <a:avLst/>

</xml_diff>

<commit_message>
docs: final polish of Week 11-14 documents and slides
</commit_message>
<xml_diff>
--- a/documentation/Week 11 Assignment — Deployment/CSE4204-8A-T05 Deployment.docx
+++ b/documentation/Week 11 Assignment — Deployment/CSE4204-8A-T05 Deployment.docx
@@ -941,7 +941,7 @@
               <w:rPr/>
               <w:drawing>
                 <wp:inline distT="0" distB="0" distL="0" distR="0">
-                  <wp:extent cx="1619250" cy="1619250"/>
+                  <wp:extent cx="1428750" cy="1428750"/>
                   <wp:effectExtent l="0" t="0" r="0" b="0"/>
                   <wp:docPr id="1" name="qr-app.png" descr="Live application&#10;https://ai-resume-analyzer-psi-lime.vercel.app"/>
                   <wp:cNvGraphicFramePr>
@@ -965,7 +965,7 @@
                         <pic:spPr bwMode="auto">
                           <a:xfrm>
                             <a:off x="0" y="0"/>
-                            <a:ext cx="1619250" cy="1619250"/>
+                            <a:ext cx="1428750" cy="1428750"/>
                           </a:xfrm>
                           <a:prstGeom prst="rect">
                             <a:avLst/>
@@ -1029,7 +1029,7 @@
               <w:rPr/>
               <w:drawing>
                 <wp:inline distT="0" distB="0" distL="0" distR="0">
-                  <wp:extent cx="1619250" cy="1619250"/>
+                  <wp:extent cx="1428750" cy="1428750"/>
                   <wp:effectExtent l="0" t="0" r="0" b="0"/>
                   <wp:docPr id="2" name="qr-repo.png" descr="Source code (GitHub)&#10;https://github.com/mahamud894/AI_Resume_Analyzer"/>
                   <wp:cNvGraphicFramePr>
@@ -1053,7 +1053,7 @@
                         <pic:spPr bwMode="auto">
                           <a:xfrm>
                             <a:off x="0" y="0"/>
-                            <a:ext cx="1619250" cy="1619250"/>
+                            <a:ext cx="1428750" cy="1428750"/>
                           </a:xfrm>
                           <a:prstGeom prst="rect">
                             <a:avLst/>
@@ -1553,29 +1553,6 @@
     </w:p>
     <w:p>
       <w:pPr>
-        <w:pStyle w:val="Heading2"/>
-        <w:keepNext w:val="true"/>
-        <w:rPr/>
-      </w:pPr>
-      <w:r>
-        <w:rPr/>
-        <w:t>1.1 Demo account</w:t>
-      </w:r>
-    </w:p>
-    <w:p>
-      <w:pPr>
-        <w:pStyle w:val="Normal"/>
-        <w:spacing w:lineRule="auto" w:line="360" w:before="0" w:after="120"/>
-        <w:jc w:val="both"/>
-        <w:rPr/>
-      </w:pPr>
-      <w:r>
-        <w:rPr/>
-        <w:t>Examiners can create their own account in a few seconds (Sign Up or Sign in with Google), or use the team's demo account shared during the presentation. No personal data is required.</w:t>
-      </w:r>
-    </w:p>
-    <w:p>
-      <w:pPr>
         <w:pStyle w:val="Heading1"/>
         <w:keepNext w:val="true"/>
         <w:rPr/>
@@ -1597,7 +1574,7 @@
         <w:rPr/>
         <w:drawing>
           <wp:inline distT="0" distB="0" distL="0" distR="0">
-            <wp:extent cx="5667375" cy="3133725"/>
+            <wp:extent cx="4791075" cy="2647950"/>
             <wp:effectExtent l="0" t="0" r="0" b="0"/>
             <wp:docPr id="3" name="architecture.png" descr="Deployment architecture&#10;Deployment architecture"/>
             <wp:cNvGraphicFramePr>
@@ -1621,7 +1598,7 @@
                   <pic:spPr bwMode="auto">
                     <a:xfrm>
                       <a:off x="0" y="0"/>
-                      <a:ext cx="5667375" cy="3133725"/>
+                      <a:ext cx="4791075" cy="2647950"/>
                     </a:xfrm>
                     <a:prstGeom prst="rect">
                       <a:avLst/>
@@ -3799,7 +3776,7 @@
                 <w:sz w:val="17"/>
                 <w:szCs w:val="17"/>
               </w:rPr>
-              <w:t xml:space="preserve">   ├─▶ </w:t>
+              <w:t xml:space="preserve">   ├─</w:t>
             </w:r>
             <w:r>
               <w:rPr>
@@ -3807,7 +3784,7 @@
                 <w:sz w:val="17"/>
                 <w:szCs w:val="17"/>
               </w:rPr>
-              <w:t>GitHub Actions: backend  → npm ci → npm test (48 tests)</w:t>
+              <w:t>&gt; GitHub Actions: backend  → npm ci → npm test (48 tests)</w:t>
             </w:r>
           </w:p>
           <w:p>
@@ -3845,7 +3822,7 @@
                 <w:sz w:val="17"/>
                 <w:szCs w:val="17"/>
               </w:rPr>
-              <w:t xml:space="preserve">   ├─▶ </w:t>
+              <w:t xml:space="preserve">   ├─</w:t>
             </w:r>
             <w:r>
               <w:rPr>
@@ -3853,7 +3830,7 @@
                 <w:sz w:val="17"/>
                 <w:szCs w:val="17"/>
               </w:rPr>
-              <w:t>Render  : npm ci --omit=dev → npm start → health check → live</w:t>
+              <w:t>&gt; Render  : npm ci --omit=dev → npm start → health check → live</w:t>
             </w:r>
           </w:p>
           <w:p>
@@ -3868,7 +3845,7 @@
                 <w:sz w:val="17"/>
                 <w:szCs w:val="17"/>
               </w:rPr>
-              <w:t xml:space="preserve">   └─▶ </w:t>
+              <w:t xml:space="preserve">   └─</w:t>
             </w:r>
             <w:r>
               <w:rPr>
@@ -3876,7 +3853,7 @@
                 <w:sz w:val="17"/>
                 <w:szCs w:val="17"/>
               </w:rPr>
-              <w:t>Vercel  : react-router build (SPA) → live</w:t>
+              <w:t>&gt; Vercel  : react-router build (SPA) → live</w:t>
             </w:r>
           </w:p>
         </w:tc>
@@ -4852,77 +4829,35 @@
     </w:p>
     <w:p>
       <w:pPr>
-        <w:pStyle w:val="Heading2"/>
-        <w:keepNext w:val="true"/>
-        <w:rPr/>
-      </w:pPr>
-      <w:r>
-        <w:rPr/>
-        <w:t>5.1 Keeping the demo stable</w:t>
-      </w:r>
-    </w:p>
-    <w:p>
-      <w:pPr>
-        <w:pStyle w:val="ListParagraph"/>
-        <w:numPr>
-          <w:ilvl w:val="0"/>
-          <w:numId w:val="1"/>
-        </w:numPr>
-        <w:spacing w:lineRule="exact" w:line="360" w:before="0" w:after="60"/>
+        <w:pStyle w:val="Normal"/>
+        <w:spacing w:lineRule="auto" w:line="360" w:before="0" w:after="120"/>
         <w:jc w:val="both"/>
         <w:rPr/>
       </w:pPr>
       <w:r>
-        <w:rPr/>
-        <w:t>Wake the backend by opening /api/health 2–3 minutes before the presentation.</w:t>
-      </w:r>
-    </w:p>
-    <w:p>
-      <w:pPr>
-        <w:pStyle w:val="ListParagraph"/>
-        <w:numPr>
-          <w:ilvl w:val="0"/>
-          <w:numId w:val="1"/>
-        </w:numPr>
-        <w:spacing w:lineRule="exact" w:line="360" w:before="0" w:after="60"/>
-        <w:jc w:val="both"/>
-        <w:rPr/>
-      </w:pPr>
-      <w:r>
-        <w:rPr/>
-        <w:t>Keep a resume PDF and a job description ready on the presentation laptop.</w:t>
-      </w:r>
-    </w:p>
-    <w:p>
-      <w:pPr>
-        <w:pStyle w:val="ListParagraph"/>
-        <w:numPr>
-          <w:ilvl w:val="0"/>
-          <w:numId w:val="1"/>
-        </w:numPr>
-        <w:spacing w:lineRule="exact" w:line="360" w:before="0" w:after="60"/>
-        <w:jc w:val="both"/>
-        <w:rPr/>
-      </w:pPr>
-      <w:r>
-        <w:rPr/>
-        <w:t>Prepare a demo account that already contains one finished analysis, CV and cover letter.</w:t>
-      </w:r>
-    </w:p>
-    <w:p>
-      <w:pPr>
-        <w:pStyle w:val="ListParagraph"/>
-        <w:numPr>
-          <w:ilvl w:val="0"/>
-          <w:numId w:val="1"/>
-        </w:numPr>
-        <w:spacing w:lineRule="exact" w:line="360" w:before="0" w:after="60"/>
-        <w:jc w:val="both"/>
-        <w:rPr/>
-      </w:pPr>
-      <w:r>
-        <w:rPr/>
-        <w:t>Keep backup screenshots (in the presentation slides) in case the internet or Gemini is unavailable.</w:t>
+        <w:rPr>
+          <w:b/>
+          <w:bCs/>
+        </w:rPr>
+        <w:t>Keeping the demo stable:</w:t>
+      </w:r>
+      <w:r>
+        <w:rPr/>
+        <w:t xml:space="preserve"> open </w:t>
+      </w:r>
+      <w:r>
+        <w:rPr>
+          <w:rFonts w:eastAsia="Courier New" w:cs="Courier New" w:ascii="Courier New" w:hAnsi="Courier New"/>
+          <w:b w:val="false"/>
+          <w:bCs w:val="false"/>
+          <w:sz w:val="22"/>
+          <w:szCs w:val="22"/>
+        </w:rPr>
+        <w:t>/api/health</w:t>
+      </w:r>
+      <w:r>
+        <w:rPr/>
+        <w:t xml:space="preserve"> 2–3 minutes before the presentation to wake the backend, keep a resume PDF and job description ready, and use the demo account and the backup screenshots in the slides if the internet or Gemini is unavailable.</w:t>
       </w:r>
     </w:p>
     <w:sectPr>

</xml_diff>

<commit_message>
docs: university logo on cover and page numbers in submission documents
</commit_message>
<xml_diff>
--- a/documentation/Week 11 Assignment — Deployment/CSE4204-8A-T05 Deployment.docx
+++ b/documentation/Week 11 Assignment — Deployment/CSE4204-8A-T05 Deployment.docx
@@ -5,7 +5,55 @@
     <w:p>
       <w:pPr>
         <w:pStyle w:val="Normal"/>
-        <w:spacing w:lineRule="exact" w:line="276" w:before="600" w:after="40"/>
+        <w:spacing w:lineRule="auto" w:line="240" w:before="0" w:after="240"/>
+        <w:jc w:val="center"/>
+        <w:rPr/>
+      </w:pPr>
+      <w:r>
+        <w:rPr/>
+        <w:drawing>
+          <wp:inline distT="0" distB="0" distL="0" distR="0">
+            <wp:extent cx="1400175" cy="1647825"/>
+            <wp:effectExtent l="0" t="0" r="0" b="0"/>
+            <wp:docPr id="1" name="nubtk-logo" descr="NUBT Khulna logo&#10;Northern University of Business and Technology Khulna logo"/>
+            <wp:cNvGraphicFramePr>
+              <a:graphicFrameLocks xmlns:a="http://schemas.openxmlformats.org/drawingml/2006/main" noChangeAspect="1"/>
+            </wp:cNvGraphicFramePr>
+            <a:graphic xmlns:a="http://schemas.openxmlformats.org/drawingml/2006/main">
+              <a:graphicData uri="http://schemas.openxmlformats.org/drawingml/2006/picture">
+                <pic:pic xmlns:pic="http://schemas.openxmlformats.org/drawingml/2006/picture">
+                  <pic:nvPicPr>
+                    <pic:cNvPr id="1" name="nubtk-logo" descr="NUBT Khulna logo&#10;Northern University of Business and Technology Khulna logo"/>
+                    <pic:cNvPicPr>
+                      <a:picLocks noChangeAspect="1" noChangeArrowheads="1"/>
+                    </pic:cNvPicPr>
+                  </pic:nvPicPr>
+                  <pic:blipFill>
+                    <a:blip r:embed="rId2"/>
+                    <a:stretch>
+                      <a:fillRect/>
+                    </a:stretch>
+                  </pic:blipFill>
+                  <pic:spPr bwMode="auto">
+                    <a:xfrm>
+                      <a:off x="0" y="0"/>
+                      <a:ext cx="1400175" cy="1647825"/>
+                    </a:xfrm>
+                    <a:prstGeom prst="rect">
+                      <a:avLst/>
+                    </a:prstGeom>
+                  </pic:spPr>
+                </pic:pic>
+              </a:graphicData>
+            </a:graphic>
+          </wp:inline>
+        </w:drawing>
+      </w:r>
+    </w:p>
+    <w:p>
+      <w:pPr>
+        <w:pStyle w:val="Normal"/>
+        <w:spacing w:lineRule="exact" w:line="276" w:before="0" w:after="40"/>
         <w:jc w:val="center"/>
         <w:rPr/>
       </w:pPr>
@@ -23,7 +71,7 @@
     <w:p>
       <w:pPr>
         <w:pStyle w:val="Normal"/>
-        <w:spacing w:lineRule="exact" w:line="276" w:before="0" w:after="1400"/>
+        <w:spacing w:lineRule="exact" w:line="276" w:before="0" w:after="1300"/>
         <w:jc w:val="center"/>
         <w:rPr/>
       </w:pPr>
@@ -39,7 +87,7 @@
     <w:p>
       <w:pPr>
         <w:pStyle w:val="Normal"/>
-        <w:spacing w:lineRule="exact" w:line="276" w:before="0" w:after="800"/>
+        <w:spacing w:lineRule="exact" w:line="276" w:before="0" w:after="900"/>
         <w:jc w:val="center"/>
         <w:rPr/>
       </w:pPr>
@@ -95,7 +143,7 @@
     <w:p>
       <w:pPr>
         <w:pStyle w:val="Normal"/>
-        <w:spacing w:lineRule="exact" w:line="276" w:before="0" w:after="2600"/>
+        <w:spacing w:lineRule="exact" w:line="276" w:before="0" w:after="2300"/>
         <w:jc w:val="center"/>
         <w:rPr/>
       </w:pPr>
@@ -708,7 +756,7 @@
               <w:spacing w:lineRule="exact" w:line="264" w:before="0" w:after="20"/>
               <w:rPr/>
             </w:pPr>
-            <w:hyperlink r:id="rId2">
+            <w:hyperlink r:id="rId3">
               <w:r>
                 <w:rPr>
                   <w:rStyle w:val="ListLabel13"/>
@@ -774,7 +822,7 @@
               <w:spacing w:lineRule="exact" w:line="264" w:before="0" w:after="20"/>
               <w:rPr/>
             </w:pPr>
-            <w:hyperlink r:id="rId3">
+            <w:hyperlink r:id="rId4">
               <w:r>
                 <w:rPr>
                   <w:rStyle w:val="ListLabel13"/>
@@ -840,7 +888,7 @@
               <w:spacing w:lineRule="exact" w:line="264" w:before="0" w:after="20"/>
               <w:rPr/>
             </w:pPr>
-            <w:hyperlink r:id="rId4">
+            <w:hyperlink r:id="rId5">
               <w:r>
                 <w:rPr>
                   <w:rStyle w:val="ListLabel13"/>
@@ -943,7 +991,7 @@
                 <wp:inline distT="0" distB="0" distL="0" distR="0">
                   <wp:extent cx="1428750" cy="1428750"/>
                   <wp:effectExtent l="0" t="0" r="0" b="0"/>
-                  <wp:docPr id="1" name="qr-app.png" descr="Live application&#10;https://ai-resume-analyzer-psi-lime.vercel.app"/>
+                  <wp:docPr id="2" name="qr-app.png" descr="Live application&#10;https://ai-resume-analyzer-psi-lime.vercel.app"/>
                   <wp:cNvGraphicFramePr>
                     <a:graphicFrameLocks xmlns:a="http://schemas.openxmlformats.org/drawingml/2006/main" noChangeAspect="1"/>
                   </wp:cNvGraphicFramePr>
@@ -951,95 +999,7 @@
                     <a:graphicData uri="http://schemas.openxmlformats.org/drawingml/2006/picture">
                       <pic:pic xmlns:pic="http://schemas.openxmlformats.org/drawingml/2006/picture">
                         <pic:nvPicPr>
-                          <pic:cNvPr id="1" name="qr-app.png" descr="Live application&#10;https://ai-resume-analyzer-psi-lime.vercel.app"/>
-                          <pic:cNvPicPr>
-                            <a:picLocks noChangeAspect="1" noChangeArrowheads="1"/>
-                          </pic:cNvPicPr>
-                        </pic:nvPicPr>
-                        <pic:blipFill>
-                          <a:blip r:embed="rId5"/>
-                          <a:stretch>
-                            <a:fillRect/>
-                          </a:stretch>
-                        </pic:blipFill>
-                        <pic:spPr bwMode="auto">
-                          <a:xfrm>
-                            <a:off x="0" y="0"/>
-                            <a:ext cx="1428750" cy="1428750"/>
-                          </a:xfrm>
-                          <a:prstGeom prst="rect">
-                            <a:avLst/>
-                          </a:prstGeom>
-                        </pic:spPr>
-                      </pic:pic>
-                    </a:graphicData>
-                  </a:graphic>
-                </wp:inline>
-              </w:drawing>
-            </w:r>
-          </w:p>
-          <w:p>
-            <w:pPr>
-              <w:pStyle w:val="Normal"/>
-              <w:spacing w:before="80" w:after="120"/>
-              <w:jc w:val="center"/>
-              <w:rPr/>
-            </w:pPr>
-            <w:r>
-              <w:rPr>
-                <w:b/>
-                <w:bCs/>
-                <w:sz w:val="24"/>
-                <w:szCs w:val="24"/>
-              </w:rPr>
-              <w:t>Live application</w:t>
-            </w:r>
-          </w:p>
-          <w:p>
-            <w:pPr>
-              <w:pStyle w:val="Normal"/>
-              <w:spacing w:before="0" w:after="120"/>
-              <w:jc w:val="center"/>
-              <w:rPr/>
-            </w:pPr>
-            <w:r>
-              <w:rPr>
-                <w:sz w:val="20"/>
-                <w:szCs w:val="20"/>
-              </w:rPr>
-              <w:t>https://ai-resume-analyzer-psi-lime.vercel.app</w:t>
-            </w:r>
-          </w:p>
-        </w:tc>
-        <w:tc>
-          <w:tcPr>
-            <w:tcW w:w="4512" w:type="dxa"/>
-            <w:tcBorders>
-              <w:left w:val="single" w:sz="24" w:space="0" w:color="FFFFFF"/>
-            </w:tcBorders>
-          </w:tcPr>
-          <w:p>
-            <w:pPr>
-              <w:pStyle w:val="Normal"/>
-              <w:spacing w:lineRule="auto" w:line="240"/>
-              <w:jc w:val="center"/>
-              <w:rPr/>
-            </w:pPr>
-            <w:r>
-              <w:rPr/>
-              <w:drawing>
-                <wp:inline distT="0" distB="0" distL="0" distR="0">
-                  <wp:extent cx="1428750" cy="1428750"/>
-                  <wp:effectExtent l="0" t="0" r="0" b="0"/>
-                  <wp:docPr id="2" name="qr-repo.png" descr="Source code (GitHub)&#10;https://github.com/mahamud894/AI_Resume_Analyzer"/>
-                  <wp:cNvGraphicFramePr>
-                    <a:graphicFrameLocks xmlns:a="http://schemas.openxmlformats.org/drawingml/2006/main" noChangeAspect="1"/>
-                  </wp:cNvGraphicFramePr>
-                  <a:graphic xmlns:a="http://schemas.openxmlformats.org/drawingml/2006/main">
-                    <a:graphicData uri="http://schemas.openxmlformats.org/drawingml/2006/picture">
-                      <pic:pic xmlns:pic="http://schemas.openxmlformats.org/drawingml/2006/picture">
-                        <pic:nvPicPr>
-                          <pic:cNvPr id="2" name="qr-repo.png" descr="Source code (GitHub)&#10;https://github.com/mahamud894/AI_Resume_Analyzer"/>
+                          <pic:cNvPr id="2" name="qr-app.png" descr="Live application&#10;https://ai-resume-analyzer-psi-lime.vercel.app"/>
                           <pic:cNvPicPr>
                             <a:picLocks noChangeAspect="1" noChangeArrowheads="1"/>
                           </pic:cNvPicPr>
@@ -1080,6 +1040,94 @@
                 <w:sz w:val="24"/>
                 <w:szCs w:val="24"/>
               </w:rPr>
+              <w:t>Live application</w:t>
+            </w:r>
+          </w:p>
+          <w:p>
+            <w:pPr>
+              <w:pStyle w:val="Normal"/>
+              <w:spacing w:before="0" w:after="120"/>
+              <w:jc w:val="center"/>
+              <w:rPr/>
+            </w:pPr>
+            <w:r>
+              <w:rPr>
+                <w:sz w:val="20"/>
+                <w:szCs w:val="20"/>
+              </w:rPr>
+              <w:t>https://ai-resume-analyzer-psi-lime.vercel.app</w:t>
+            </w:r>
+          </w:p>
+        </w:tc>
+        <w:tc>
+          <w:tcPr>
+            <w:tcW w:w="4512" w:type="dxa"/>
+            <w:tcBorders>
+              <w:left w:val="single" w:sz="24" w:space="0" w:color="FFFFFF"/>
+            </w:tcBorders>
+          </w:tcPr>
+          <w:p>
+            <w:pPr>
+              <w:pStyle w:val="Normal"/>
+              <w:spacing w:lineRule="auto" w:line="240"/>
+              <w:jc w:val="center"/>
+              <w:rPr/>
+            </w:pPr>
+            <w:r>
+              <w:rPr/>
+              <w:drawing>
+                <wp:inline distT="0" distB="0" distL="0" distR="0">
+                  <wp:extent cx="1428750" cy="1428750"/>
+                  <wp:effectExtent l="0" t="0" r="0" b="0"/>
+                  <wp:docPr id="3" name="qr-repo.png" descr="Source code (GitHub)&#10;https://github.com/mahamud894/AI_Resume_Analyzer"/>
+                  <wp:cNvGraphicFramePr>
+                    <a:graphicFrameLocks xmlns:a="http://schemas.openxmlformats.org/drawingml/2006/main" noChangeAspect="1"/>
+                  </wp:cNvGraphicFramePr>
+                  <a:graphic xmlns:a="http://schemas.openxmlformats.org/drawingml/2006/main">
+                    <a:graphicData uri="http://schemas.openxmlformats.org/drawingml/2006/picture">
+                      <pic:pic xmlns:pic="http://schemas.openxmlformats.org/drawingml/2006/picture">
+                        <pic:nvPicPr>
+                          <pic:cNvPr id="3" name="qr-repo.png" descr="Source code (GitHub)&#10;https://github.com/mahamud894/AI_Resume_Analyzer"/>
+                          <pic:cNvPicPr>
+                            <a:picLocks noChangeAspect="1" noChangeArrowheads="1"/>
+                          </pic:cNvPicPr>
+                        </pic:nvPicPr>
+                        <pic:blipFill>
+                          <a:blip r:embed="rId7"/>
+                          <a:stretch>
+                            <a:fillRect/>
+                          </a:stretch>
+                        </pic:blipFill>
+                        <pic:spPr bwMode="auto">
+                          <a:xfrm>
+                            <a:off x="0" y="0"/>
+                            <a:ext cx="1428750" cy="1428750"/>
+                          </a:xfrm>
+                          <a:prstGeom prst="rect">
+                            <a:avLst/>
+                          </a:prstGeom>
+                        </pic:spPr>
+                      </pic:pic>
+                    </a:graphicData>
+                  </a:graphic>
+                </wp:inline>
+              </w:drawing>
+            </w:r>
+          </w:p>
+          <w:p>
+            <w:pPr>
+              <w:pStyle w:val="Normal"/>
+              <w:spacing w:before="80" w:after="120"/>
+              <w:jc w:val="center"/>
+              <w:rPr/>
+            </w:pPr>
+            <w:r>
+              <w:rPr>
+                <w:b/>
+                <w:bCs/>
+                <w:sz w:val="24"/>
+                <w:szCs w:val="24"/>
+              </w:rPr>
               <w:t>Source code (GitHub)</w:t>
             </w:r>
           </w:p>
@@ -1576,7 +1624,7 @@
           <wp:inline distT="0" distB="0" distL="0" distR="0">
             <wp:extent cx="4791075" cy="2647950"/>
             <wp:effectExtent l="0" t="0" r="0" b="0"/>
-            <wp:docPr id="3" name="architecture.png" descr="Deployment architecture&#10;Deployment architecture"/>
+            <wp:docPr id="4" name="architecture.png" descr="Deployment architecture&#10;Deployment architecture"/>
             <wp:cNvGraphicFramePr>
               <a:graphicFrameLocks xmlns:a="http://schemas.openxmlformats.org/drawingml/2006/main" noChangeAspect="1"/>
             </wp:cNvGraphicFramePr>
@@ -1584,13 +1632,13 @@
               <a:graphicData uri="http://schemas.openxmlformats.org/drawingml/2006/picture">
                 <pic:pic xmlns:pic="http://schemas.openxmlformats.org/drawingml/2006/picture">
                   <pic:nvPicPr>
-                    <pic:cNvPr id="3" name="architecture.png" descr="Deployment architecture&#10;Deployment architecture"/>
+                    <pic:cNvPr id="4" name="architecture.png" descr="Deployment architecture&#10;Deployment architecture"/>
                     <pic:cNvPicPr>
                       <a:picLocks noChangeAspect="1" noChangeArrowheads="1"/>
                     </pic:cNvPicPr>
                   </pic:nvPicPr>
                   <pic:blipFill>
-                    <a:blip r:embed="rId7"/>
+                    <a:blip r:embed="rId8"/>
                     <a:stretch>
                       <a:fillRect/>
                     </a:stretch>
@@ -4861,16 +4909,83 @@
       </w:r>
     </w:p>
     <w:sectPr>
+      <w:footerReference w:type="even" r:id="rId9"/>
+      <w:footerReference w:type="default" r:id="rId10"/>
+      <w:footerReference w:type="first" r:id="rId11"/>
       <w:type w:val="nextPage"/>
       <w:pgSz w:w="11906" w:h="16838"/>
-      <w:pgMar w:left="1440" w:right="1440" w:gutter="0" w:header="0" w:top="1440" w:footer="0" w:bottom="1440"/>
+      <w:pgMar w:left="1440" w:right="1440" w:gutter="0" w:header="0" w:top="1440" w:footer="700" w:bottom="1440"/>
       <w:pgNumType w:fmt="decimal"/>
       <w:formProt w:val="false"/>
+      <w:titlePg/>
       <w:textDirection w:val="lrTb"/>
       <w:docGrid w:type="default" w:linePitch="360" w:charSpace="0"/>
     </w:sectPr>
   </w:body>
 </w:document>
+</file>
+
+<file path=word/footer1.xml><?xml version="1.0" encoding="utf-8"?>
+<w:ftr xmlns:o="urn:schemas-microsoft-com:office:office" xmlns:r="http://schemas.openxmlformats.org/officeDocument/2006/relationships" xmlns:v="urn:schemas-microsoft-com:vml" xmlns:w="http://schemas.openxmlformats.org/wordprocessingml/2006/main" xmlns:w10="urn:schemas-microsoft-com:office:word" xmlns:wp="http://schemas.openxmlformats.org/drawingml/2006/wordprocessingDrawing" xmlns:wps="http://schemas.microsoft.com/office/word/2010/wordprocessingShape" xmlns:wpg="http://schemas.microsoft.com/office/word/2010/wordprocessingGroup" xmlns:mc="http://schemas.openxmlformats.org/markup-compatibility/2006" xmlns:wp14="http://schemas.microsoft.com/office/word/2010/wordprocessingDrawing" xmlns:w14="http://schemas.microsoft.com/office/word/2010/wordml" xmlns:w15="http://schemas.microsoft.com/office/word/2012/wordml" mc:Ignorable="w14 wp14 w15">
+  <w:p>
+    <w:pPr>
+      <w:pStyle w:val="Footer"/>
+      <w:spacing w:before="0" w:after="120"/>
+      <w:rPr/>
+    </w:pPr>
+    <w:r>
+      <w:rPr/>
+    </w:r>
+  </w:p>
+</w:ftr>
+</file>
+
+<file path=word/footer2.xml><?xml version="1.0" encoding="utf-8"?>
+<w:ftr xmlns:o="urn:schemas-microsoft-com:office:office" xmlns:r="http://schemas.openxmlformats.org/officeDocument/2006/relationships" xmlns:v="urn:schemas-microsoft-com:vml" xmlns:w="http://schemas.openxmlformats.org/wordprocessingml/2006/main" xmlns:w10="urn:schemas-microsoft-com:office:word" xmlns:wp="http://schemas.openxmlformats.org/drawingml/2006/wordprocessingDrawing" xmlns:wps="http://schemas.microsoft.com/office/word/2010/wordprocessingShape" xmlns:wpg="http://schemas.microsoft.com/office/word/2010/wordprocessingGroup" xmlns:mc="http://schemas.openxmlformats.org/markup-compatibility/2006" xmlns:wp14="http://schemas.microsoft.com/office/word/2010/wordprocessingDrawing" xmlns:w14="http://schemas.microsoft.com/office/word/2010/wordml" xmlns:w15="http://schemas.microsoft.com/office/word/2012/wordml" mc:Ignorable="w14 wp14 w15">
+  <w:p>
+    <w:pPr>
+      <w:pStyle w:val="Normal"/>
+      <w:spacing w:lineRule="exact" w:line="240" w:before="0" w:after="0"/>
+      <w:jc w:val="center"/>
+      <w:rPr/>
+    </w:pPr>
+    <w:r>
+      <w:rPr/>
+      <w:fldChar w:fldCharType="begin"/>
+    </w:r>
+    <w:r>
+      <w:rPr/>
+      <w:instrText xml:space="preserve"> PAGE </w:instrText>
+    </w:r>
+    <w:r>
+      <w:rPr/>
+      <w:fldChar w:fldCharType="separate"/>
+    </w:r>
+    <w:r>
+      <w:rPr/>
+      <w:t>6</w:t>
+    </w:r>
+    <w:r>
+      <w:rPr/>
+      <w:fldChar w:fldCharType="end"/>
+    </w:r>
+  </w:p>
+</w:ftr>
+</file>
+
+<file path=word/footer3.xml><?xml version="1.0" encoding="utf-8"?>
+<w:ftr xmlns:o="urn:schemas-microsoft-com:office:office" xmlns:r="http://schemas.openxmlformats.org/officeDocument/2006/relationships" xmlns:v="urn:schemas-microsoft-com:vml" xmlns:w="http://schemas.openxmlformats.org/wordprocessingml/2006/main" xmlns:w10="urn:schemas-microsoft-com:office:word" xmlns:wp="http://schemas.openxmlformats.org/drawingml/2006/wordprocessingDrawing" xmlns:wps="http://schemas.microsoft.com/office/word/2010/wordprocessingShape" xmlns:wpg="http://schemas.microsoft.com/office/word/2010/wordprocessingGroup" xmlns:mc="http://schemas.openxmlformats.org/markup-compatibility/2006" xmlns:wp14="http://schemas.microsoft.com/office/word/2010/wordprocessingDrawing" xmlns:w14="http://schemas.microsoft.com/office/word/2010/wordml" xmlns:w15="http://schemas.microsoft.com/office/word/2012/wordml" mc:Ignorable="w14 wp14 w15">
+  <w:p>
+    <w:pPr>
+      <w:pStyle w:val="Normal"/>
+      <w:spacing w:before="0" w:after="120"/>
+      <w:rPr/>
+    </w:pPr>
+    <w:r>
+      <w:rPr/>
+    </w:r>
+  </w:p>
+</w:ftr>
 </file>
 
 <file path=word/numbering.xml><?xml version="1.0" encoding="utf-8"?>
@@ -5367,7 +5482,7 @@
   <w:docDefaults>
     <w:rPrDefault>
       <w:rPr>
-        <w:rFonts w:ascii="Times New Roman" w:hAnsi="Times New Roman" w:eastAsia="Times New Roman" w:cs="Times New Roman"/>
+        <w:rFonts w:ascii="Times New Roman" w:hAnsi="Times New Roman" w:eastAsia="Times New Roman" w:cs="Noto Serif Bengali"/>
         <w:color w:val="000000"/>
         <w:sz w:val="24"/>
         <w:szCs w:val="24"/>
@@ -5390,7 +5505,7 @@
       <w:jc w:val="left"/>
     </w:pPr>
     <w:rPr>
-      <w:rFonts w:ascii="Times New Roman" w:hAnsi="Times New Roman" w:eastAsia="Times New Roman" w:cs="Times New Roman"/>
+      <w:rFonts w:ascii="Times New Roman" w:hAnsi="Times New Roman" w:eastAsia="Times New Roman" w:cs="Noto Serif Bengali"/>
       <w:color w:val="000000"/>
       <w:kern w:val="0"/>
       <w:sz w:val="24"/>
@@ -5407,7 +5522,7 @@
       <w:outlineLvl w:val="0"/>
     </w:pPr>
     <w:rPr>
-      <w:rFonts w:ascii="Times New Roman" w:hAnsi="Times New Roman" w:eastAsia="Times New Roman" w:cs="Times New Roman"/>
+      <w:rFonts w:ascii="Times New Roman" w:hAnsi="Times New Roman" w:eastAsia="Times New Roman" w:cs="Noto Serif Bengali"/>
       <w:b/>
       <w:bCs/>
       <w:color w:val="000000"/>
@@ -5424,7 +5539,7 @@
       <w:outlineLvl w:val="1"/>
     </w:pPr>
     <w:rPr>
-      <w:rFonts w:ascii="Times New Roman" w:hAnsi="Times New Roman" w:eastAsia="Times New Roman" w:cs="Times New Roman"/>
+      <w:rFonts w:ascii="Times New Roman" w:hAnsi="Times New Roman" w:eastAsia="Times New Roman" w:cs="Noto Serif Bengali"/>
       <w:b/>
       <w:bCs/>
       <w:color w:val="000000"/>
@@ -5441,7 +5556,7 @@
       <w:outlineLvl w:val="2"/>
     </w:pPr>
     <w:rPr>
-      <w:rFonts w:ascii="Times New Roman" w:hAnsi="Times New Roman" w:eastAsia="Times New Roman" w:cs="Times New Roman"/>
+      <w:rFonts w:ascii="Times New Roman" w:hAnsi="Times New Roman" w:eastAsia="Times New Roman" w:cs="Noto Serif Bengali"/>
       <w:b/>
       <w:bCs/>
       <w:color w:val="000000"/>
@@ -5621,7 +5736,7 @@
       <w:jc w:val="left"/>
     </w:pPr>
     <w:rPr>
-      <w:rFonts w:ascii="Times New Roman" w:hAnsi="Times New Roman" w:eastAsia="Times New Roman" w:cs="Times New Roman"/>
+      <w:rFonts w:ascii="Times New Roman" w:hAnsi="Times New Roman" w:eastAsia="Times New Roman" w:cs="Noto Serif Bengali"/>
       <w:b/>
       <w:bCs/>
       <w:color w:val="000000"/>
@@ -5641,7 +5756,7 @@
       <w:jc w:val="left"/>
     </w:pPr>
     <w:rPr>
-      <w:rFonts w:ascii="Times New Roman" w:hAnsi="Times New Roman" w:eastAsia="Times New Roman" w:cs="Times New Roman"/>
+      <w:rFonts w:ascii="Times New Roman" w:hAnsi="Times New Roman" w:eastAsia="Times New Roman" w:cs="Noto Serif Bengali"/>
       <w:color w:val="000000"/>
       <w:kern w:val="0"/>
       <w:sz w:val="24"/>
@@ -5678,6 +5793,19 @@
       <w:sz w:val="20"/>
       <w:szCs w:val="20"/>
     </w:rPr>
+  </w:style>
+  <w:style w:type="paragraph" w:styleId="HeaderandFooter">
+    <w:name w:val="Header and Footer"/>
+    <w:basedOn w:val="Normal"/>
+    <w:qFormat/>
+    <w:pPr/>
+    <w:rPr/>
+  </w:style>
+  <w:style w:type="paragraph" w:styleId="Footer">
+    <w:name w:val="Footer"/>
+    <w:basedOn w:val="HeaderandFooter"/>
+    <w:pPr/>
+    <w:rPr/>
   </w:style>
 </w:styles>
 </file>

</xml_diff>

<commit_message>
docs: logo between course details and supervisor on cover
</commit_message>
<xml_diff>
--- a/documentation/Week 11 Assignment — Deployment/CSE4204-8A-T05 Deployment.docx
+++ b/documentation/Week 11 Assignment — Deployment/CSE4204-8A-T05 Deployment.docx
@@ -5,7 +5,116 @@
     <w:p>
       <w:pPr>
         <w:pStyle w:val="Normal"/>
-        <w:spacing w:lineRule="auto" w:line="240" w:before="0" w:after="240"/>
+        <w:spacing w:lineRule="exact" w:line="276" w:before="600" w:after="40"/>
+        <w:jc w:val="center"/>
+        <w:rPr/>
+      </w:pPr>
+      <w:r>
+        <w:rPr>
+          <w:b/>
+          <w:bCs/>
+          <w:color w:val="7030A0"/>
+          <w:sz w:val="30"/>
+          <w:szCs w:val="30"/>
+        </w:rPr>
+        <w:t>Northern University of Business and Technology Khulna</w:t>
+      </w:r>
+    </w:p>
+    <w:p>
+      <w:pPr>
+        <w:pStyle w:val="Normal"/>
+        <w:spacing w:lineRule="exact" w:line="276" w:before="0" w:after="1400"/>
+        <w:jc w:val="center"/>
+        <w:rPr/>
+      </w:pPr>
+      <w:r>
+        <w:rPr>
+          <w:color w:val="00B050"/>
+          <w:sz w:val="24"/>
+          <w:szCs w:val="24"/>
+        </w:rPr>
+        <w:t>Department of Computer Science and Engineering</w:t>
+      </w:r>
+    </w:p>
+    <w:p>
+      <w:pPr>
+        <w:pStyle w:val="Normal"/>
+        <w:spacing w:lineRule="exact" w:line="276" w:before="0" w:after="800"/>
+        <w:jc w:val="center"/>
+        <w:rPr/>
+      </w:pPr>
+      <w:r>
+        <w:rPr>
+          <w:b/>
+          <w:bCs/>
+          <w:color w:val="FF0000"/>
+          <w:sz w:val="36"/>
+          <w:szCs w:val="36"/>
+        </w:rPr>
+        <w:t>WEEK 11: DEPLOYMENT REPORT</w:t>
+      </w:r>
+    </w:p>
+    <w:p>
+      <w:pPr>
+        <w:pStyle w:val="Normal"/>
+        <w:spacing w:lineRule="exact" w:line="276" w:before="0" w:after="240"/>
+        <w:jc w:val="center"/>
+        <w:rPr/>
+      </w:pPr>
+      <w:r>
+        <w:rPr>
+          <w:b/>
+          <w:bCs/>
+        </w:rPr>
+        <w:t xml:space="preserve">Project Title: </w:t>
+      </w:r>
+      <w:r>
+        <w:rPr/>
+        <w:t>AI-Powered Resume Analyzer and Career Copilot (RESUMIND)</w:t>
+      </w:r>
+    </w:p>
+    <w:p>
+      <w:pPr>
+        <w:pStyle w:val="Normal"/>
+        <w:spacing w:lineRule="exact" w:line="276" w:before="0" w:after="240"/>
+        <w:jc w:val="center"/>
+        <w:rPr/>
+      </w:pPr>
+      <w:r>
+        <w:rPr>
+          <w:b/>
+          <w:bCs/>
+        </w:rPr>
+        <w:t xml:space="preserve">Course Title: </w:t>
+      </w:r>
+      <w:r>
+        <w:rPr/>
+        <w:t>Mobile Computing Lab</w:t>
+      </w:r>
+    </w:p>
+    <w:p>
+      <w:pPr>
+        <w:pStyle w:val="Normal"/>
+        <w:spacing w:lineRule="exact" w:line="276" w:before="0" w:after="400"/>
+        <w:jc w:val="center"/>
+        <w:rPr/>
+      </w:pPr>
+      <w:r>
+        <w:rPr>
+          <w:b/>
+          <w:bCs/>
+        </w:rPr>
+        <w:t xml:space="preserve">Course Code: </w:t>
+      </w:r>
+      <w:r>
+        <w:rPr/>
+        <w:t>CSE4204</w:t>
+      </w:r>
+    </w:p>
+    <w:p>
+      <w:pPr>
+        <w:pStyle w:val="Normal"/>
+        <w:spacing w:lineRule="auto" w:line="240" w:before="0" w:after="300"/>
         <w:jc w:val="center"/>
         <w:rPr/>
       </w:pPr>
@@ -13,7 +122,7 @@
         <w:rPr/>
         <w:drawing>
           <wp:inline distT="0" distB="0" distL="0" distR="0">
-            <wp:extent cx="1400175" cy="1647825"/>
+            <wp:extent cx="1247775" cy="1466850"/>
             <wp:effectExtent l="0" t="0" r="0" b="0"/>
             <wp:docPr id="1" name="nubtk-logo" descr="NUBT Khulna logo&#10;Northern University of Business and Technology Khulna logo"/>
             <wp:cNvGraphicFramePr>
@@ -37,7 +146,7 @@
                   <pic:spPr bwMode="auto">
                     <a:xfrm>
                       <a:off x="0" y="0"/>
-                      <a:ext cx="1400175" cy="1647825"/>
+                      <a:ext cx="1247775" cy="1466850"/>
                     </a:xfrm>
                     <a:prstGeom prst="rect">
                       <a:avLst/>
@@ -48,115 +157,6 @@
             </a:graphic>
           </wp:inline>
         </w:drawing>
-      </w:r>
-    </w:p>
-    <w:p>
-      <w:pPr>
-        <w:pStyle w:val="Normal"/>
-        <w:spacing w:lineRule="exact" w:line="276" w:before="0" w:after="40"/>
-        <w:jc w:val="center"/>
-        <w:rPr/>
-      </w:pPr>
-      <w:r>
-        <w:rPr>
-          <w:b/>
-          <w:bCs/>
-          <w:color w:val="7030A0"/>
-          <w:sz w:val="30"/>
-          <w:szCs w:val="30"/>
-        </w:rPr>
-        <w:t>Northern University of Business and Technology Khulna</w:t>
-      </w:r>
-    </w:p>
-    <w:p>
-      <w:pPr>
-        <w:pStyle w:val="Normal"/>
-        <w:spacing w:lineRule="exact" w:line="276" w:before="0" w:after="1300"/>
-        <w:jc w:val="center"/>
-        <w:rPr/>
-      </w:pPr>
-      <w:r>
-        <w:rPr>
-          <w:color w:val="00B050"/>
-          <w:sz w:val="24"/>
-          <w:szCs w:val="24"/>
-        </w:rPr>
-        <w:t>Department of Computer Science and Engineering</w:t>
-      </w:r>
-    </w:p>
-    <w:p>
-      <w:pPr>
-        <w:pStyle w:val="Normal"/>
-        <w:spacing w:lineRule="exact" w:line="276" w:before="0" w:after="900"/>
-        <w:jc w:val="center"/>
-        <w:rPr/>
-      </w:pPr>
-      <w:r>
-        <w:rPr>
-          <w:b/>
-          <w:bCs/>
-          <w:color w:val="FF0000"/>
-          <w:sz w:val="36"/>
-          <w:szCs w:val="36"/>
-        </w:rPr>
-        <w:t>WEEK 11: DEPLOYMENT REPORT</w:t>
-      </w:r>
-    </w:p>
-    <w:p>
-      <w:pPr>
-        <w:pStyle w:val="Normal"/>
-        <w:spacing w:lineRule="exact" w:line="276" w:before="0" w:after="240"/>
-        <w:jc w:val="center"/>
-        <w:rPr/>
-      </w:pPr>
-      <w:r>
-        <w:rPr>
-          <w:b/>
-          <w:bCs/>
-        </w:rPr>
-        <w:t xml:space="preserve">Project Title: </w:t>
-      </w:r>
-      <w:r>
-        <w:rPr/>
-        <w:t>AI-Powered Resume Analyzer and Career Copilot (RESUMIND)</w:t>
-      </w:r>
-    </w:p>
-    <w:p>
-      <w:pPr>
-        <w:pStyle w:val="Normal"/>
-        <w:spacing w:lineRule="exact" w:line="276" w:before="0" w:after="240"/>
-        <w:jc w:val="center"/>
-        <w:rPr/>
-      </w:pPr>
-      <w:r>
-        <w:rPr>
-          <w:b/>
-          <w:bCs/>
-        </w:rPr>
-        <w:t xml:space="preserve">Course Title: </w:t>
-      </w:r>
-      <w:r>
-        <w:rPr/>
-        <w:t>Mobile Computing Lab</w:t>
-      </w:r>
-    </w:p>
-    <w:p>
-      <w:pPr>
-        <w:pStyle w:val="Normal"/>
-        <w:spacing w:lineRule="exact" w:line="276" w:before="0" w:after="2300"/>
-        <w:jc w:val="center"/>
-        <w:rPr/>
-      </w:pPr>
-      <w:r>
-        <w:rPr>
-          <w:b/>
-          <w:bCs/>
-        </w:rPr>
-        <w:t xml:space="preserve">Course Code: </w:t>
-      </w:r>
-      <w:r>
-        <w:rPr/>
-        <w:t>CSE4204</w:t>
       </w:r>
     </w:p>
     <w:p>

</xml_diff>

<commit_message>
docs: full-page cover with today's submission date
</commit_message>
<xml_diff>
--- a/documentation/Week 11 Assignment — Deployment/CSE4204-8A-T05 Deployment.docx
+++ b/documentation/Week 11 Assignment — Deployment/CSE4204-8A-T05 Deployment.docx
@@ -5,7 +5,7 @@
     <w:p>
       <w:pPr>
         <w:pStyle w:val="Normal"/>
-        <w:spacing w:lineRule="exact" w:line="276" w:before="600" w:after="40"/>
+        <w:spacing w:lineRule="exact" w:line="276" w:before="200" w:after="80"/>
         <w:jc w:val="center"/>
         <w:rPr/>
       </w:pPr>
@@ -14,8 +14,8 @@
           <w:b/>
           <w:bCs/>
           <w:color w:val="7030A0"/>
-          <w:sz w:val="30"/>
-          <w:szCs w:val="30"/>
+          <w:sz w:val="34"/>
+          <w:szCs w:val="34"/>
         </w:rPr>
         <w:t>Northern University of Business and Technology Khulna</w:t>
       </w:r>
@@ -23,15 +23,15 @@
     <w:p>
       <w:pPr>
         <w:pStyle w:val="Normal"/>
-        <w:spacing w:lineRule="exact" w:line="276" w:before="0" w:after="1400"/>
+        <w:spacing w:lineRule="exact" w:line="276" w:before="0" w:after="1650"/>
         <w:jc w:val="center"/>
         <w:rPr/>
       </w:pPr>
       <w:r>
         <w:rPr>
           <w:color w:val="00B050"/>
-          <w:sz w:val="24"/>
-          <w:szCs w:val="24"/>
+          <w:sz w:val="26"/>
+          <w:szCs w:val="26"/>
         </w:rPr>
         <w:t>Department of Computer Science and Engineering</w:t>
       </w:r>
@@ -39,7 +39,7 @@
     <w:p>
       <w:pPr>
         <w:pStyle w:val="Normal"/>
-        <w:spacing w:lineRule="exact" w:line="276" w:before="0" w:after="800"/>
+        <w:spacing w:lineRule="exact" w:line="276" w:before="0" w:after="1250"/>
         <w:jc w:val="center"/>
         <w:rPr/>
       </w:pPr>
@@ -48,8 +48,8 @@
           <w:b/>
           <w:bCs/>
           <w:color w:val="FF0000"/>
-          <w:sz w:val="36"/>
-          <w:szCs w:val="36"/>
+          <w:sz w:val="40"/>
+          <w:szCs w:val="40"/>
         </w:rPr>
         <w:t>WEEK 11: DEPLOYMENT REPORT</w:t>
       </w:r>
@@ -57,7 +57,7 @@
     <w:p>
       <w:pPr>
         <w:pStyle w:val="Normal"/>
-        <w:spacing w:lineRule="exact" w:line="276" w:before="0" w:after="240"/>
+        <w:spacing w:lineRule="exact" w:line="276" w:before="0" w:after="320"/>
         <w:jc w:val="center"/>
         <w:rPr/>
       </w:pPr>
@@ -65,18 +65,23 @@
         <w:rPr>
           <w:b/>
           <w:bCs/>
+          <w:sz w:val="26"/>
+          <w:szCs w:val="26"/>
         </w:rPr>
         <w:t xml:space="preserve">Project Title: </w:t>
       </w:r>
       <w:r>
-        <w:rPr/>
+        <w:rPr>
+          <w:sz w:val="26"/>
+          <w:szCs w:val="26"/>
+        </w:rPr>
         <w:t>AI-Powered Resume Analyzer and Career Copilot (RESUMIND)</w:t>
       </w:r>
     </w:p>
     <w:p>
       <w:pPr>
         <w:pStyle w:val="Normal"/>
-        <w:spacing w:lineRule="exact" w:line="276" w:before="0" w:after="240"/>
+        <w:spacing w:lineRule="exact" w:line="276" w:before="0" w:after="320"/>
         <w:jc w:val="center"/>
         <w:rPr/>
       </w:pPr>
@@ -84,18 +89,23 @@
         <w:rPr>
           <w:b/>
           <w:bCs/>
+          <w:sz w:val="26"/>
+          <w:szCs w:val="26"/>
         </w:rPr>
         <w:t xml:space="preserve">Course Title: </w:t>
       </w:r>
       <w:r>
-        <w:rPr/>
+        <w:rPr>
+          <w:sz w:val="26"/>
+          <w:szCs w:val="26"/>
+        </w:rPr>
         <w:t>Mobile Computing Lab</w:t>
       </w:r>
     </w:p>
     <w:p>
       <w:pPr>
         <w:pStyle w:val="Normal"/>
-        <w:spacing w:lineRule="exact" w:line="276" w:before="0" w:after="400"/>
+        <w:spacing w:lineRule="exact" w:line="276" w:before="0" w:after="1100"/>
         <w:jc w:val="center"/>
         <w:rPr/>
       </w:pPr>
@@ -103,18 +113,23 @@
         <w:rPr>
           <w:b/>
           <w:bCs/>
+          <w:sz w:val="26"/>
+          <w:szCs w:val="26"/>
         </w:rPr>
         <w:t xml:space="preserve">Course Code: </w:t>
       </w:r>
       <w:r>
-        <w:rPr/>
+        <w:rPr>
+          <w:sz w:val="26"/>
+          <w:szCs w:val="26"/>
+        </w:rPr>
         <w:t>CSE4204</w:t>
       </w:r>
     </w:p>
     <w:p>
       <w:pPr>
         <w:pStyle w:val="Normal"/>
-        <w:spacing w:lineRule="auto" w:line="240" w:before="0" w:after="300"/>
+        <w:spacing w:lineRule="auto" w:line="240" w:before="0" w:after="1100"/>
         <w:jc w:val="center"/>
         <w:rPr/>
       </w:pPr>
@@ -122,7 +137,7 @@
         <w:rPr/>
         <w:drawing>
           <wp:inline distT="0" distB="0" distL="0" distR="0">
-            <wp:extent cx="1247775" cy="1466850"/>
+            <wp:extent cx="1714500" cy="2009775"/>
             <wp:effectExtent l="0" t="0" r="0" b="0"/>
             <wp:docPr id="1" name="nubtk-logo" descr="NUBT Khulna logo&#10;Northern University of Business and Technology Khulna logo"/>
             <wp:cNvGraphicFramePr>
@@ -146,7 +161,7 @@
                   <pic:spPr bwMode="auto">
                     <a:xfrm>
                       <a:off x="0" y="0"/>
-                      <a:ext cx="1247775" cy="1466850"/>
+                      <a:ext cx="1714500" cy="2009775"/>
                     </a:xfrm>
                     <a:prstGeom prst="rect">
                       <a:avLst/>
@@ -162,7 +177,7 @@
     <w:p>
       <w:pPr>
         <w:pStyle w:val="Normal"/>
-        <w:spacing w:lineRule="exact" w:line="276" w:before="0" w:after="20"/>
+        <w:spacing w:lineRule="exact" w:line="276" w:before="0" w:after="60"/>
         <w:jc w:val="center"/>
         <w:rPr/>
       </w:pPr>
@@ -170,6 +185,8 @@
         <w:rPr>
           <w:b/>
           <w:bCs/>
+          <w:sz w:val="26"/>
+          <w:szCs w:val="26"/>
         </w:rPr>
         <w:t>Submitted to:</w:t>
       </w:r>
@@ -177,7 +194,7 @@
     <w:p>
       <w:pPr>
         <w:pStyle w:val="Normal"/>
-        <w:spacing w:lineRule="exact" w:line="276" w:before="0" w:after="20"/>
+        <w:spacing w:lineRule="exact" w:line="276" w:before="0" w:after="40"/>
         <w:jc w:val="center"/>
         <w:rPr/>
       </w:pPr>
@@ -186,6 +203,8 @@
           <w:b/>
           <w:bCs/>
           <w:color w:val="0070C0"/>
+          <w:sz w:val="26"/>
+          <w:szCs w:val="26"/>
         </w:rPr>
         <w:t>Md. Riaz Mahmud</w:t>
       </w:r>
@@ -193,36 +212,45 @@
     <w:p>
       <w:pPr>
         <w:pStyle w:val="Normal"/>
-        <w:spacing w:lineRule="exact" w:line="276" w:before="0" w:after="20"/>
+        <w:spacing w:lineRule="exact" w:line="276" w:before="0" w:after="40"/>
         <w:jc w:val="center"/>
         <w:rPr/>
       </w:pPr>
       <w:r>
-        <w:rPr/>
+        <w:rPr>
+          <w:sz w:val="24"/>
+          <w:szCs w:val="24"/>
+        </w:rPr>
         <w:t>Assistant Professor</w:t>
       </w:r>
     </w:p>
     <w:p>
       <w:pPr>
         <w:pStyle w:val="Normal"/>
-        <w:spacing w:lineRule="exact" w:line="276" w:before="0" w:after="20"/>
+        <w:spacing w:lineRule="exact" w:line="276" w:before="0" w:after="40"/>
         <w:jc w:val="center"/>
         <w:rPr/>
       </w:pPr>
       <w:r>
-        <w:rPr/>
+        <w:rPr>
+          <w:sz w:val="24"/>
+          <w:szCs w:val="24"/>
+        </w:rPr>
         <w:t>Department of Computer Science and Engineering</w:t>
       </w:r>
     </w:p>
     <w:p>
       <w:pPr>
         <w:pStyle w:val="Normal"/>
-        <w:spacing w:lineRule="exact" w:line="276" w:before="0" w:after="240"/>
+        <w:spacing w:lineRule="exact" w:line="276" w:before="0" w:after="700"/>
         <w:jc w:val="center"/>
         <w:rPr/>
       </w:pPr>
       <w:r>
-        <w:rPr/>
+        <w:rPr>
+          <w:sz w:val="24"/>
+          <w:szCs w:val="24"/>
+        </w:rPr>
         <w:t>Northern University of Business and Technology, Khulna</w:t>
       </w:r>
     </w:p>
@@ -237,12 +265,17 @@
         <w:rPr>
           <w:b/>
           <w:bCs/>
+          <w:sz w:val="26"/>
+          <w:szCs w:val="26"/>
         </w:rPr>
         <w:t xml:space="preserve">Submission Date: </w:t>
       </w:r>
       <w:r>
-        <w:rPr/>
-        <w:t>22 October 2026</w:t>
+        <w:rPr>
+          <w:sz w:val="26"/>
+          <w:szCs w:val="26"/>
+        </w:rPr>
+        <w:t>23 October 2026</w:t>
       </w:r>
     </w:p>
     <w:p>

</xml_diff>